<commit_message>
Updated Final Project Launch doc
</commit_message>
<xml_diff>
--- a/SDEV 255 - Web App Development - Final Project launch.docx
+++ b/SDEV 255 - Web App Development - Final Project launch.docx
@@ -138,15 +138,7 @@
           <w:sz w:val="24"/>
           <w:szCs w:val="24"/>
         </w:rPr>
-        <w:t xml:space="preserve"> </w:t>
-      </w:r>
-      <w:r>
-        <w:rPr>
-          <w:rFonts w:ascii="Times New Roman" w:hAnsi="Times New Roman" w:cs="Times New Roman"/>
-          <w:sz w:val="24"/>
-          <w:szCs w:val="24"/>
-        </w:rPr>
-        <w:t xml:space="preserve">documents </w:t>
+        <w:t xml:space="preserve"> documents </w:t>
       </w:r>
       <w:r>
         <w:rPr>
@@ -363,7 +355,7 @@
           <w:sz w:val="24"/>
           <w:szCs w:val="24"/>
         </w:rPr>
-        <w:t>Team Member Roles</w:t>
+        <w:t>Roles</w:t>
       </w:r>
     </w:p>
     <w:p>
@@ -386,8 +378,293 @@
           <w:sz w:val="24"/>
           <w:szCs w:val="24"/>
         </w:rPr>
+        <w:t xml:space="preserve">Backend Developers: </w:t>
+      </w:r>
+    </w:p>
+    <w:p>
+      <w:pPr>
+        <w:pStyle w:val="ListParagraph"/>
+        <w:numPr>
+          <w:ilvl w:val="3"/>
+          <w:numId w:val="2"/>
+        </w:numPr>
+        <w:spacing w:line="480" w:lineRule="auto"/>
+        <w:rPr>
+          <w:rFonts w:ascii="Times New Roman" w:hAnsi="Times New Roman" w:cs="Times New Roman"/>
+          <w:sz w:val="24"/>
+          <w:szCs w:val="24"/>
+        </w:rPr>
+      </w:pPr>
+      <w:r>
+        <w:rPr>
+          <w:rFonts w:ascii="Times New Roman" w:hAnsi="Times New Roman" w:cs="Times New Roman"/>
+          <w:sz w:val="24"/>
+          <w:szCs w:val="24"/>
+        </w:rPr>
+        <w:t xml:space="preserve">Set up JavaScript files necessary for functionality between front and back end. </w:t>
+      </w:r>
+    </w:p>
+    <w:p>
+      <w:pPr>
+        <w:pStyle w:val="ListParagraph"/>
+        <w:numPr>
+          <w:ilvl w:val="3"/>
+          <w:numId w:val="2"/>
+        </w:numPr>
+        <w:spacing w:line="480" w:lineRule="auto"/>
+        <w:rPr>
+          <w:rFonts w:ascii="Times New Roman" w:hAnsi="Times New Roman" w:cs="Times New Roman"/>
+          <w:sz w:val="24"/>
+          <w:szCs w:val="24"/>
+        </w:rPr>
+      </w:pPr>
+      <w:r>
+        <w:rPr>
+          <w:rFonts w:ascii="Times New Roman" w:hAnsi="Times New Roman" w:cs="Times New Roman"/>
+          <w:sz w:val="24"/>
+          <w:szCs w:val="24"/>
+        </w:rPr>
+        <w:t>Create functionality for front end elements</w:t>
+      </w:r>
+    </w:p>
+    <w:p>
+      <w:pPr>
+        <w:pStyle w:val="ListParagraph"/>
+        <w:numPr>
+          <w:ilvl w:val="3"/>
+          <w:numId w:val="2"/>
+        </w:numPr>
+        <w:spacing w:line="480" w:lineRule="auto"/>
+        <w:rPr>
+          <w:rFonts w:ascii="Times New Roman" w:hAnsi="Times New Roman" w:cs="Times New Roman"/>
+          <w:sz w:val="24"/>
+          <w:szCs w:val="24"/>
+        </w:rPr>
+      </w:pPr>
+      <w:r>
+        <w:rPr>
+          <w:rFonts w:ascii="Times New Roman" w:hAnsi="Times New Roman" w:cs="Times New Roman"/>
+          <w:sz w:val="24"/>
+          <w:szCs w:val="24"/>
+        </w:rPr>
+        <w:t>Import needed extensions and packages</w:t>
+      </w:r>
+    </w:p>
+    <w:p>
+      <w:pPr>
+        <w:pStyle w:val="ListParagraph"/>
+        <w:numPr>
+          <w:ilvl w:val="2"/>
+          <w:numId w:val="2"/>
+        </w:numPr>
+        <w:spacing w:line="480" w:lineRule="auto"/>
+        <w:rPr>
+          <w:rFonts w:ascii="Times New Roman" w:hAnsi="Times New Roman" w:cs="Times New Roman"/>
+          <w:sz w:val="24"/>
+          <w:szCs w:val="24"/>
+        </w:rPr>
+      </w:pPr>
+      <w:r>
+        <w:rPr>
+          <w:rFonts w:ascii="Times New Roman" w:hAnsi="Times New Roman" w:cs="Times New Roman"/>
+          <w:sz w:val="24"/>
+          <w:szCs w:val="24"/>
+        </w:rPr>
+        <w:lastRenderedPageBreak/>
+        <w:t>Debugger and Finalizer</w:t>
+      </w:r>
+    </w:p>
+    <w:p>
+      <w:pPr>
+        <w:pStyle w:val="ListParagraph"/>
+        <w:numPr>
+          <w:ilvl w:val="3"/>
+          <w:numId w:val="2"/>
+        </w:numPr>
+        <w:spacing w:line="480" w:lineRule="auto"/>
+        <w:rPr>
+          <w:rFonts w:ascii="Times New Roman" w:hAnsi="Times New Roman" w:cs="Times New Roman"/>
+          <w:sz w:val="24"/>
+          <w:szCs w:val="24"/>
+        </w:rPr>
+      </w:pPr>
+      <w:r>
+        <w:rPr>
+          <w:rFonts w:ascii="Times New Roman" w:hAnsi="Times New Roman" w:cs="Times New Roman"/>
+          <w:sz w:val="24"/>
+          <w:szCs w:val="24"/>
+        </w:rPr>
+        <w:t>Ensure that each file is set up properly.</w:t>
+      </w:r>
+    </w:p>
+    <w:p>
+      <w:pPr>
+        <w:pStyle w:val="ListParagraph"/>
+        <w:numPr>
+          <w:ilvl w:val="3"/>
+          <w:numId w:val="2"/>
+        </w:numPr>
+        <w:spacing w:line="480" w:lineRule="auto"/>
+        <w:rPr>
+          <w:rFonts w:ascii="Times New Roman" w:hAnsi="Times New Roman" w:cs="Times New Roman"/>
+          <w:sz w:val="24"/>
+          <w:szCs w:val="24"/>
+        </w:rPr>
+      </w:pPr>
+      <w:r>
+        <w:rPr>
+          <w:rFonts w:ascii="Times New Roman" w:hAnsi="Times New Roman" w:cs="Times New Roman"/>
+          <w:sz w:val="24"/>
+          <w:szCs w:val="24"/>
+        </w:rPr>
+        <w:t>Ensure links, modules, imports, and files interact properly</w:t>
+      </w:r>
+    </w:p>
+    <w:p>
+      <w:pPr>
+        <w:pStyle w:val="ListParagraph"/>
+        <w:numPr>
+          <w:ilvl w:val="3"/>
+          <w:numId w:val="2"/>
+        </w:numPr>
+        <w:spacing w:line="480" w:lineRule="auto"/>
+        <w:rPr>
+          <w:rFonts w:ascii="Times New Roman" w:hAnsi="Times New Roman" w:cs="Times New Roman"/>
+          <w:sz w:val="24"/>
+          <w:szCs w:val="24"/>
+        </w:rPr>
+      </w:pPr>
+      <w:r>
+        <w:rPr>
+          <w:rFonts w:ascii="Times New Roman" w:hAnsi="Times New Roman" w:cs="Times New Roman"/>
+          <w:sz w:val="24"/>
+          <w:szCs w:val="24"/>
+        </w:rPr>
+        <w:t>Merge committed branches for the final submission</w:t>
+      </w:r>
+    </w:p>
+    <w:p>
+      <w:pPr>
+        <w:pStyle w:val="ListParagraph"/>
+        <w:numPr>
+          <w:ilvl w:val="2"/>
+          <w:numId w:val="2"/>
+        </w:numPr>
+        <w:spacing w:line="480" w:lineRule="auto"/>
+        <w:rPr>
+          <w:rFonts w:ascii="Times New Roman" w:hAnsi="Times New Roman" w:cs="Times New Roman"/>
+          <w:sz w:val="24"/>
+          <w:szCs w:val="24"/>
+        </w:rPr>
+      </w:pPr>
+      <w:r>
+        <w:rPr>
+          <w:rFonts w:ascii="Times New Roman" w:hAnsi="Times New Roman" w:cs="Times New Roman"/>
+          <w:sz w:val="24"/>
+          <w:szCs w:val="24"/>
+        </w:rPr>
+        <w:t>Front End Developer</w:t>
+      </w:r>
+    </w:p>
+    <w:p>
+      <w:pPr>
+        <w:pStyle w:val="ListParagraph"/>
+        <w:numPr>
+          <w:ilvl w:val="3"/>
+          <w:numId w:val="2"/>
+        </w:numPr>
+        <w:spacing w:line="480" w:lineRule="auto"/>
+        <w:rPr>
+          <w:rFonts w:ascii="Times New Roman" w:hAnsi="Times New Roman" w:cs="Times New Roman"/>
+          <w:sz w:val="24"/>
+          <w:szCs w:val="24"/>
+        </w:rPr>
+      </w:pPr>
+      <w:r>
+        <w:rPr>
+          <w:rFonts w:ascii="Times New Roman" w:hAnsi="Times New Roman" w:cs="Times New Roman"/>
+          <w:sz w:val="24"/>
+          <w:szCs w:val="24"/>
+        </w:rPr>
+        <w:t>Create the elements needed for UI to have proper functionality</w:t>
+      </w:r>
+    </w:p>
+    <w:p>
+      <w:pPr>
+        <w:pStyle w:val="ListParagraph"/>
+        <w:numPr>
+          <w:ilvl w:val="3"/>
+          <w:numId w:val="2"/>
+        </w:numPr>
+        <w:spacing w:line="480" w:lineRule="auto"/>
+        <w:rPr>
+          <w:rFonts w:ascii="Times New Roman" w:hAnsi="Times New Roman" w:cs="Times New Roman"/>
+          <w:sz w:val="24"/>
+          <w:szCs w:val="24"/>
+        </w:rPr>
+      </w:pPr>
+      <w:r>
+        <w:rPr>
+          <w:rFonts w:ascii="Times New Roman" w:hAnsi="Times New Roman" w:cs="Times New Roman"/>
+          <w:sz w:val="24"/>
+          <w:szCs w:val="24"/>
+        </w:rPr>
+        <w:t xml:space="preserve">Create </w:t>
+      </w:r>
+    </w:p>
+    <w:p>
+      <w:pPr>
+        <w:pStyle w:val="ListParagraph"/>
+        <w:numPr>
+          <w:ilvl w:val="1"/>
+          <w:numId w:val="2"/>
+        </w:numPr>
+        <w:spacing w:line="480" w:lineRule="auto"/>
+        <w:rPr>
+          <w:rFonts w:ascii="Times New Roman" w:hAnsi="Times New Roman" w:cs="Times New Roman"/>
+          <w:sz w:val="24"/>
+          <w:szCs w:val="24"/>
+        </w:rPr>
+      </w:pPr>
+      <w:r>
+        <w:rPr>
+          <w:rFonts w:ascii="Times New Roman" w:hAnsi="Times New Roman" w:cs="Times New Roman"/>
+          <w:sz w:val="24"/>
+          <w:szCs w:val="24"/>
+        </w:rPr>
+        <w:t xml:space="preserve">Team Members </w:t>
+      </w:r>
+    </w:p>
+    <w:p>
+      <w:pPr>
+        <w:pStyle w:val="ListParagraph"/>
+        <w:numPr>
+          <w:ilvl w:val="2"/>
+          <w:numId w:val="2"/>
+        </w:numPr>
+        <w:spacing w:line="480" w:lineRule="auto"/>
+        <w:rPr>
+          <w:rFonts w:ascii="Times New Roman" w:hAnsi="Times New Roman" w:cs="Times New Roman"/>
+          <w:sz w:val="24"/>
+          <w:szCs w:val="24"/>
+        </w:rPr>
+      </w:pPr>
+      <w:r>
+        <w:rPr>
+          <w:rFonts w:ascii="Times New Roman" w:hAnsi="Times New Roman" w:cs="Times New Roman"/>
+          <w:sz w:val="24"/>
+          <w:szCs w:val="24"/>
+        </w:rPr>
         <w:t>Caleb</w:t>
       </w:r>
+      <w:r>
+        <w:rPr>
+          <w:rFonts w:ascii="Times New Roman" w:hAnsi="Times New Roman" w:cs="Times New Roman"/>
+          <w:sz w:val="24"/>
+          <w:szCs w:val="24"/>
+        </w:rPr>
+        <w:t>: Backend Developer</w:t>
+      </w:r>
     </w:p>
     <w:p>
       <w:pPr>
@@ -411,6 +688,14 @@
         </w:rPr>
         <w:t>Criag</w:t>
       </w:r>
+      <w:r>
+        <w:rPr>
+          <w:rFonts w:ascii="Times New Roman" w:hAnsi="Times New Roman" w:cs="Times New Roman"/>
+          <w:sz w:val="24"/>
+          <w:szCs w:val="24"/>
+        </w:rPr>
+        <w:t>: Front End Developer</w:t>
+      </w:r>
     </w:p>
     <w:p>
       <w:pPr>
@@ -434,6 +719,30 @@
         </w:rPr>
         <w:t>Derek</w:t>
       </w:r>
+      <w:r>
+        <w:rPr>
+          <w:rFonts w:ascii="Times New Roman" w:hAnsi="Times New Roman" w:cs="Times New Roman"/>
+          <w:sz w:val="24"/>
+          <w:szCs w:val="24"/>
+        </w:rPr>
+        <w:t xml:space="preserve">: </w:t>
+      </w:r>
+      <w:r>
+        <w:rPr>
+          <w:rFonts w:ascii="Times New Roman" w:hAnsi="Times New Roman" w:cs="Times New Roman"/>
+          <w:sz w:val="24"/>
+          <w:szCs w:val="24"/>
+        </w:rPr>
+        <w:t xml:space="preserve">Project Manager </w:t>
+      </w:r>
+      <w:r>
+        <w:rPr>
+          <w:rFonts w:ascii="Times New Roman" w:hAnsi="Times New Roman" w:cs="Times New Roman"/>
+          <w:sz w:val="24"/>
+          <w:szCs w:val="24"/>
+        </w:rPr>
+        <w:t>and Logic Developer</w:t>
+      </w:r>
     </w:p>
     <w:p>
       <w:pPr>
@@ -457,6 +766,30 @@
         </w:rPr>
         <w:t>Dominique</w:t>
       </w:r>
+      <w:r>
+        <w:rPr>
+          <w:rFonts w:ascii="Times New Roman" w:hAnsi="Times New Roman" w:cs="Times New Roman"/>
+          <w:sz w:val="24"/>
+          <w:szCs w:val="24"/>
+        </w:rPr>
+        <w:t xml:space="preserve">: Debugger and </w:t>
+      </w:r>
+      <w:r>
+        <w:rPr>
+          <w:rFonts w:ascii="Times New Roman" w:hAnsi="Times New Roman" w:cs="Times New Roman"/>
+          <w:sz w:val="24"/>
+          <w:szCs w:val="24"/>
+        </w:rPr>
+        <w:t>F</w:t>
+      </w:r>
+      <w:r>
+        <w:rPr>
+          <w:rFonts w:ascii="Times New Roman" w:hAnsi="Times New Roman" w:cs="Times New Roman"/>
+          <w:sz w:val="24"/>
+          <w:szCs w:val="24"/>
+        </w:rPr>
+        <w:t>inalizer</w:t>
+      </w:r>
     </w:p>
     <w:p>
       <w:pPr>
@@ -478,9 +811,16 @@
           <w:sz w:val="24"/>
           <w:szCs w:val="24"/>
         </w:rPr>
-        <w:lastRenderedPageBreak/>
         <w:t>Gary</w:t>
       </w:r>
+      <w:r>
+        <w:rPr>
+          <w:rFonts w:ascii="Times New Roman" w:hAnsi="Times New Roman" w:cs="Times New Roman"/>
+          <w:sz w:val="24"/>
+          <w:szCs w:val="24"/>
+        </w:rPr>
+        <w:t>: Backend Developer</w:t>
+      </w:r>
     </w:p>
     <w:p>
       <w:pPr>
@@ -504,30 +844,14 @@
         </w:rPr>
         <w:t>Sutton</w:t>
       </w:r>
-    </w:p>
-    <w:p>
-      <w:pPr>
-        <w:spacing w:line="480" w:lineRule="auto"/>
-        <w:rPr>
-          <w:rFonts w:ascii="Times New Roman" w:hAnsi="Times New Roman" w:cs="Times New Roman"/>
-          <w:sz w:val="24"/>
-          <w:szCs w:val="24"/>
-        </w:rPr>
-      </w:pPr>
-    </w:p>
-    <w:p>
-      <w:pPr>
-        <w:numPr>
-          <w:ilvl w:val="0"/>
-          <w:numId w:val="1"/>
-        </w:numPr>
-        <w:spacing w:line="360" w:lineRule="auto"/>
-        <w:rPr>
-          <w:rFonts w:ascii="Times New Roman" w:hAnsi="Times New Roman" w:cs="Times New Roman"/>
-          <w:sz w:val="24"/>
-          <w:szCs w:val="24"/>
-        </w:rPr>
-      </w:pPr>
+      <w:r>
+        <w:rPr>
+          <w:rFonts w:ascii="Times New Roman" w:hAnsi="Times New Roman" w:cs="Times New Roman"/>
+          <w:sz w:val="24"/>
+          <w:szCs w:val="24"/>
+        </w:rPr>
+        <w:t>: Backend Developer</w:t>
+      </w:r>
     </w:p>
     <w:sectPr>
       <w:headerReference w:type="default" r:id="rId9"/>
@@ -607,6 +931,9 @@
     <w:r>
       <w:t>Module 3</w:t>
     </w:r>
+    <w:r>
+      <w:t>-4</w:t>
+    </w:r>
   </w:p>
   <w:p>
     <w:pPr>
@@ -621,7 +948,13 @@
       <w:pStyle w:val="Header"/>
     </w:pPr>
     <w:r>
-      <w:t>April 2, 2026</w:t>
+      <w:t>April 2</w:t>
+    </w:r>
+    <w:r>
+      <w:t>0</w:t>
+    </w:r>
+    <w:r>
+      <w:t>, 2026</w:t>
     </w:r>
   </w:p>
 </w:hdr>

</xml_diff>

<commit_message>
Updated final launch doc
Updated the Project Final Launch doc for submission.
</commit_message>
<xml_diff>
--- a/SDEV 255 - Web App Development - Final Project launch.docx
+++ b/SDEV 255 - Web App Development - Final Project launch.docx
@@ -96,25 +96,7 @@
           <w:sz w:val="24"/>
           <w:szCs w:val="24"/>
         </w:rPr>
-        <w:t xml:space="preserve">, </w:t>
-      </w:r>
-      <w:proofErr w:type="gramStart"/>
-      <w:r>
-        <w:rPr>
-          <w:rFonts w:ascii="Times New Roman" w:hAnsi="Times New Roman" w:cs="Times New Roman"/>
-          <w:sz w:val="24"/>
-          <w:szCs w:val="24"/>
-        </w:rPr>
-        <w:t>as long as</w:t>
-      </w:r>
-      <w:proofErr w:type="gramEnd"/>
-      <w:r>
-        <w:rPr>
-          <w:rFonts w:ascii="Times New Roman" w:hAnsi="Times New Roman" w:cs="Times New Roman"/>
-          <w:sz w:val="24"/>
-          <w:szCs w:val="24"/>
-        </w:rPr>
-        <w:t xml:space="preserve"> each person is openly contributing. For organization, we have established a GitHub repository</w:t>
+        <w:t>, as long as each person is openly contributing. For organization, we have established a GitHub repository</w:t>
       </w:r>
       <w:r>
         <w:rPr>
@@ -218,23 +200,13 @@
           <w:szCs w:val="24"/>
         </w:rPr>
       </w:pPr>
-      <w:proofErr w:type="spellStart"/>
-      <w:r>
-        <w:rPr>
-          <w:rFonts w:ascii="Times New Roman" w:hAnsi="Times New Roman" w:cs="Times New Roman"/>
-          <w:sz w:val="24"/>
-          <w:szCs w:val="24"/>
-        </w:rPr>
-        <w:t>Github</w:t>
-      </w:r>
-      <w:proofErr w:type="spellEnd"/>
-      <w:r>
-        <w:rPr>
-          <w:rFonts w:ascii="Times New Roman" w:hAnsi="Times New Roman" w:cs="Times New Roman"/>
-          <w:sz w:val="24"/>
-          <w:szCs w:val="24"/>
-        </w:rPr>
-        <w:t xml:space="preserve"> Repository: </w:t>
+      <w:r>
+        <w:rPr>
+          <w:rFonts w:ascii="Times New Roman" w:hAnsi="Times New Roman" w:cs="Times New Roman"/>
+          <w:sz w:val="24"/>
+          <w:szCs w:val="24"/>
+        </w:rPr>
+        <w:t xml:space="preserve">Github Repository: </w:t>
       </w:r>
     </w:p>
     <w:p>
@@ -283,7 +255,39 @@
           <w:sz w:val="24"/>
           <w:szCs w:val="24"/>
         </w:rPr>
-        <w:t>Trello Board:</w:t>
+        <w:t>Trello Board</w:t>
+      </w:r>
+      <w:r>
+        <w:rPr>
+          <w:rFonts w:ascii="Times New Roman" w:hAnsi="Times New Roman" w:cs="Times New Roman"/>
+          <w:sz w:val="24"/>
+          <w:szCs w:val="24"/>
+        </w:rPr>
+        <w:t xml:space="preserve"> (Further explains </w:t>
+      </w:r>
+      <w:r>
+        <w:rPr>
+          <w:rFonts w:ascii="Times New Roman" w:hAnsi="Times New Roman" w:cs="Times New Roman"/>
+          <w:sz w:val="24"/>
+          <w:szCs w:val="24"/>
+        </w:rPr>
+        <w:t xml:space="preserve">individually </w:t>
+      </w:r>
+      <w:r>
+        <w:rPr>
+          <w:rFonts w:ascii="Times New Roman" w:hAnsi="Times New Roman" w:cs="Times New Roman"/>
+          <w:sz w:val="24"/>
+          <w:szCs w:val="24"/>
+        </w:rPr>
+        <w:t>assigned tasks)</w:t>
+      </w:r>
+      <w:r>
+        <w:rPr>
+          <w:rFonts w:ascii="Times New Roman" w:hAnsi="Times New Roman" w:cs="Times New Roman"/>
+          <w:sz w:val="24"/>
+          <w:szCs w:val="24"/>
+        </w:rPr>
+        <w:t>:</w:t>
       </w:r>
     </w:p>
     <w:p>
@@ -308,7 +312,25 @@
             <w:sz w:val="24"/>
             <w:szCs w:val="24"/>
           </w:rPr>
-          <w:t>https://trello.com/b/z0GrjI9m/sdev-255-final-project</w:t>
+          <w:t>https://trello</w:t>
+        </w:r>
+        <w:r>
+          <w:rPr>
+            <w:rStyle w:val="Hyperlink"/>
+            <w:rFonts w:ascii="Times New Roman" w:hAnsi="Times New Roman" w:cs="Times New Roman"/>
+            <w:sz w:val="24"/>
+            <w:szCs w:val="24"/>
+          </w:rPr>
+          <w:t>.</w:t>
+        </w:r>
+        <w:r>
+          <w:rPr>
+            <w:rStyle w:val="Hyperlink"/>
+            <w:rFonts w:ascii="Times New Roman" w:hAnsi="Times New Roman" w:cs="Times New Roman"/>
+            <w:sz w:val="24"/>
+            <w:szCs w:val="24"/>
+          </w:rPr>
+          <w:t>com/b/z0GrjI9m/sdev-255-final-project</w:t>
         </w:r>
       </w:hyperlink>
     </w:p>
@@ -355,7 +377,7 @@
           <w:sz w:val="24"/>
           <w:szCs w:val="24"/>
         </w:rPr>
-        <w:t>Roles</w:t>
+        <w:t xml:space="preserve">Team Members </w:t>
       </w:r>
     </w:p>
     <w:p>
@@ -378,76 +400,23 @@
           <w:sz w:val="24"/>
           <w:szCs w:val="24"/>
         </w:rPr>
-        <w:t xml:space="preserve">Backend Developers: </w:t>
-      </w:r>
-    </w:p>
-    <w:p>
-      <w:pPr>
-        <w:pStyle w:val="ListParagraph"/>
-        <w:numPr>
-          <w:ilvl w:val="3"/>
-          <w:numId w:val="2"/>
-        </w:numPr>
-        <w:spacing w:line="480" w:lineRule="auto"/>
-        <w:rPr>
-          <w:rFonts w:ascii="Times New Roman" w:hAnsi="Times New Roman" w:cs="Times New Roman"/>
-          <w:sz w:val="24"/>
-          <w:szCs w:val="24"/>
-        </w:rPr>
-      </w:pPr>
-      <w:r>
-        <w:rPr>
-          <w:rFonts w:ascii="Times New Roman" w:hAnsi="Times New Roman" w:cs="Times New Roman"/>
-          <w:sz w:val="24"/>
-          <w:szCs w:val="24"/>
-        </w:rPr>
-        <w:t xml:space="preserve">Set up JavaScript files necessary for functionality between front and back end. </w:t>
-      </w:r>
-    </w:p>
-    <w:p>
-      <w:pPr>
-        <w:pStyle w:val="ListParagraph"/>
-        <w:numPr>
-          <w:ilvl w:val="3"/>
-          <w:numId w:val="2"/>
-        </w:numPr>
-        <w:spacing w:line="480" w:lineRule="auto"/>
-        <w:rPr>
-          <w:rFonts w:ascii="Times New Roman" w:hAnsi="Times New Roman" w:cs="Times New Roman"/>
-          <w:sz w:val="24"/>
-          <w:szCs w:val="24"/>
-        </w:rPr>
-      </w:pPr>
-      <w:r>
-        <w:rPr>
-          <w:rFonts w:ascii="Times New Roman" w:hAnsi="Times New Roman" w:cs="Times New Roman"/>
-          <w:sz w:val="24"/>
-          <w:szCs w:val="24"/>
-        </w:rPr>
-        <w:t>Create functionality for front end elements</w:t>
-      </w:r>
-    </w:p>
-    <w:p>
-      <w:pPr>
-        <w:pStyle w:val="ListParagraph"/>
-        <w:numPr>
-          <w:ilvl w:val="3"/>
-          <w:numId w:val="2"/>
-        </w:numPr>
-        <w:spacing w:line="480" w:lineRule="auto"/>
-        <w:rPr>
-          <w:rFonts w:ascii="Times New Roman" w:hAnsi="Times New Roman" w:cs="Times New Roman"/>
-          <w:sz w:val="24"/>
-          <w:szCs w:val="24"/>
-        </w:rPr>
-      </w:pPr>
-      <w:r>
-        <w:rPr>
-          <w:rFonts w:ascii="Times New Roman" w:hAnsi="Times New Roman" w:cs="Times New Roman"/>
-          <w:sz w:val="24"/>
-          <w:szCs w:val="24"/>
-        </w:rPr>
-        <w:t>Import needed extensions and packages</w:t>
+        <w:t>Caleb</w:t>
+      </w:r>
+      <w:r>
+        <w:rPr>
+          <w:rFonts w:ascii="Times New Roman" w:hAnsi="Times New Roman" w:cs="Times New Roman"/>
+          <w:sz w:val="24"/>
+          <w:szCs w:val="24"/>
+        </w:rPr>
+        <w:t>: Backend Developer</w:t>
+      </w:r>
+      <w:r>
+        <w:rPr>
+          <w:rFonts w:ascii="Times New Roman" w:hAnsi="Times New Roman" w:cs="Times New Roman"/>
+          <w:sz w:val="24"/>
+          <w:szCs w:val="24"/>
+        </w:rPr>
+        <w:t xml:space="preserve"> and floater if needed</w:t>
       </w:r>
     </w:p>
     <w:p>
@@ -470,77 +439,15 @@
           <w:sz w:val="24"/>
           <w:szCs w:val="24"/>
         </w:rPr>
-        <w:lastRenderedPageBreak/>
-        <w:t>Debugger and Finalizer</w:t>
-      </w:r>
-    </w:p>
-    <w:p>
-      <w:pPr>
-        <w:pStyle w:val="ListParagraph"/>
-        <w:numPr>
-          <w:ilvl w:val="3"/>
-          <w:numId w:val="2"/>
-        </w:numPr>
-        <w:spacing w:line="480" w:lineRule="auto"/>
-        <w:rPr>
-          <w:rFonts w:ascii="Times New Roman" w:hAnsi="Times New Roman" w:cs="Times New Roman"/>
-          <w:sz w:val="24"/>
-          <w:szCs w:val="24"/>
-        </w:rPr>
-      </w:pPr>
-      <w:r>
-        <w:rPr>
-          <w:rFonts w:ascii="Times New Roman" w:hAnsi="Times New Roman" w:cs="Times New Roman"/>
-          <w:sz w:val="24"/>
-          <w:szCs w:val="24"/>
-        </w:rPr>
-        <w:t>Ensure that each file is set up properly.</w:t>
-      </w:r>
-    </w:p>
-    <w:p>
-      <w:pPr>
-        <w:pStyle w:val="ListParagraph"/>
-        <w:numPr>
-          <w:ilvl w:val="3"/>
-          <w:numId w:val="2"/>
-        </w:numPr>
-        <w:spacing w:line="480" w:lineRule="auto"/>
-        <w:rPr>
-          <w:rFonts w:ascii="Times New Roman" w:hAnsi="Times New Roman" w:cs="Times New Roman"/>
-          <w:sz w:val="24"/>
-          <w:szCs w:val="24"/>
-        </w:rPr>
-      </w:pPr>
-      <w:r>
-        <w:rPr>
-          <w:rFonts w:ascii="Times New Roman" w:hAnsi="Times New Roman" w:cs="Times New Roman"/>
-          <w:sz w:val="24"/>
-          <w:szCs w:val="24"/>
-        </w:rPr>
-        <w:t>Ensure links, modules, imports, and files interact properly</w:t>
-      </w:r>
-    </w:p>
-    <w:p>
-      <w:pPr>
-        <w:pStyle w:val="ListParagraph"/>
-        <w:numPr>
-          <w:ilvl w:val="3"/>
-          <w:numId w:val="2"/>
-        </w:numPr>
-        <w:spacing w:line="480" w:lineRule="auto"/>
-        <w:rPr>
-          <w:rFonts w:ascii="Times New Roman" w:hAnsi="Times New Roman" w:cs="Times New Roman"/>
-          <w:sz w:val="24"/>
-          <w:szCs w:val="24"/>
-        </w:rPr>
-      </w:pPr>
-      <w:r>
-        <w:rPr>
-          <w:rFonts w:ascii="Times New Roman" w:hAnsi="Times New Roman" w:cs="Times New Roman"/>
-          <w:sz w:val="24"/>
-          <w:szCs w:val="24"/>
-        </w:rPr>
-        <w:t>Merge committed branches for the final submission</w:t>
+        <w:t>Criag</w:t>
+      </w:r>
+      <w:r>
+        <w:rPr>
+          <w:rFonts w:ascii="Times New Roman" w:hAnsi="Times New Roman" w:cs="Times New Roman"/>
+          <w:sz w:val="24"/>
+          <w:szCs w:val="24"/>
+        </w:rPr>
+        <w:t>: Front End Developer</w:t>
       </w:r>
     </w:p>
     <w:p>
@@ -563,76 +470,31 @@
           <w:sz w:val="24"/>
           <w:szCs w:val="24"/>
         </w:rPr>
-        <w:t>Front End Developer</w:t>
-      </w:r>
-    </w:p>
-    <w:p>
-      <w:pPr>
-        <w:pStyle w:val="ListParagraph"/>
-        <w:numPr>
-          <w:ilvl w:val="3"/>
-          <w:numId w:val="2"/>
-        </w:numPr>
-        <w:spacing w:line="480" w:lineRule="auto"/>
-        <w:rPr>
-          <w:rFonts w:ascii="Times New Roman" w:hAnsi="Times New Roman" w:cs="Times New Roman"/>
-          <w:sz w:val="24"/>
-          <w:szCs w:val="24"/>
-        </w:rPr>
-      </w:pPr>
-      <w:r>
-        <w:rPr>
-          <w:rFonts w:ascii="Times New Roman" w:hAnsi="Times New Roman" w:cs="Times New Roman"/>
-          <w:sz w:val="24"/>
-          <w:szCs w:val="24"/>
-        </w:rPr>
-        <w:t>Create the elements needed for UI to have proper functionality</w:t>
-      </w:r>
-    </w:p>
-    <w:p>
-      <w:pPr>
-        <w:pStyle w:val="ListParagraph"/>
-        <w:numPr>
-          <w:ilvl w:val="3"/>
-          <w:numId w:val="2"/>
-        </w:numPr>
-        <w:spacing w:line="480" w:lineRule="auto"/>
-        <w:rPr>
-          <w:rFonts w:ascii="Times New Roman" w:hAnsi="Times New Roman" w:cs="Times New Roman"/>
-          <w:sz w:val="24"/>
-          <w:szCs w:val="24"/>
-        </w:rPr>
-      </w:pPr>
-      <w:r>
-        <w:rPr>
-          <w:rFonts w:ascii="Times New Roman" w:hAnsi="Times New Roman" w:cs="Times New Roman"/>
-          <w:sz w:val="24"/>
-          <w:szCs w:val="24"/>
-        </w:rPr>
-        <w:t xml:space="preserve">Create </w:t>
-      </w:r>
-    </w:p>
-    <w:p>
-      <w:pPr>
-        <w:pStyle w:val="ListParagraph"/>
-        <w:numPr>
-          <w:ilvl w:val="1"/>
-          <w:numId w:val="2"/>
-        </w:numPr>
-        <w:spacing w:line="480" w:lineRule="auto"/>
-        <w:rPr>
-          <w:rFonts w:ascii="Times New Roman" w:hAnsi="Times New Roman" w:cs="Times New Roman"/>
-          <w:sz w:val="24"/>
-          <w:szCs w:val="24"/>
-        </w:rPr>
-      </w:pPr>
-      <w:r>
-        <w:rPr>
-          <w:rFonts w:ascii="Times New Roman" w:hAnsi="Times New Roman" w:cs="Times New Roman"/>
-          <w:sz w:val="24"/>
-          <w:szCs w:val="24"/>
-        </w:rPr>
-        <w:t xml:space="preserve">Team Members </w:t>
+        <w:t>Derek</w:t>
+      </w:r>
+      <w:r>
+        <w:rPr>
+          <w:rFonts w:ascii="Times New Roman" w:hAnsi="Times New Roman" w:cs="Times New Roman"/>
+          <w:sz w:val="24"/>
+          <w:szCs w:val="24"/>
+        </w:rPr>
+        <w:t xml:space="preserve">: </w:t>
+      </w:r>
+      <w:r>
+        <w:rPr>
+          <w:rFonts w:ascii="Times New Roman" w:hAnsi="Times New Roman" w:cs="Times New Roman"/>
+          <w:sz w:val="24"/>
+          <w:szCs w:val="24"/>
+        </w:rPr>
+        <w:t xml:space="preserve">Project Manager </w:t>
+      </w:r>
+      <w:r>
+        <w:rPr>
+          <w:rFonts w:ascii="Times New Roman" w:hAnsi="Times New Roman" w:cs="Times New Roman"/>
+          <w:sz w:val="24"/>
+          <w:szCs w:val="24"/>
+        </w:rPr>
+        <w:t>and Logic Developer</w:t>
       </w:r>
     </w:p>
     <w:p>
@@ -655,15 +517,31 @@
           <w:sz w:val="24"/>
           <w:szCs w:val="24"/>
         </w:rPr>
-        <w:t>Caleb</w:t>
-      </w:r>
-      <w:r>
-        <w:rPr>
-          <w:rFonts w:ascii="Times New Roman" w:hAnsi="Times New Roman" w:cs="Times New Roman"/>
-          <w:sz w:val="24"/>
-          <w:szCs w:val="24"/>
-        </w:rPr>
-        <w:t>: Backend Developer</w:t>
+        <w:t>Dominique</w:t>
+      </w:r>
+      <w:r>
+        <w:rPr>
+          <w:rFonts w:ascii="Times New Roman" w:hAnsi="Times New Roman" w:cs="Times New Roman"/>
+          <w:sz w:val="24"/>
+          <w:szCs w:val="24"/>
+        </w:rPr>
+        <w:t xml:space="preserve">: Debugger and </w:t>
+      </w:r>
+      <w:r>
+        <w:rPr>
+          <w:rFonts w:ascii="Times New Roman" w:hAnsi="Times New Roman" w:cs="Times New Roman"/>
+          <w:sz w:val="24"/>
+          <w:szCs w:val="24"/>
+        </w:rPr>
+        <w:t>F</w:t>
+      </w:r>
+      <w:r>
+        <w:rPr>
+          <w:rFonts w:ascii="Times New Roman" w:hAnsi="Times New Roman" w:cs="Times New Roman"/>
+          <w:sz w:val="24"/>
+          <w:szCs w:val="24"/>
+        </w:rPr>
+        <w:t>inalizer</w:t>
       </w:r>
     </w:p>
     <w:p>
@@ -686,15 +564,24 @@
           <w:sz w:val="24"/>
           <w:szCs w:val="24"/>
         </w:rPr>
-        <w:t>Criag</w:t>
-      </w:r>
-      <w:r>
-        <w:rPr>
-          <w:rFonts w:ascii="Times New Roman" w:hAnsi="Times New Roman" w:cs="Times New Roman"/>
-          <w:sz w:val="24"/>
-          <w:szCs w:val="24"/>
-        </w:rPr>
-        <w:t>: Front End Developer</w:t>
+        <w:lastRenderedPageBreak/>
+        <w:t>Gary</w:t>
+      </w:r>
+      <w:r>
+        <w:rPr>
+          <w:rFonts w:ascii="Times New Roman" w:hAnsi="Times New Roman" w:cs="Times New Roman"/>
+          <w:sz w:val="24"/>
+          <w:szCs w:val="24"/>
+        </w:rPr>
+        <w:t>: Backend Developer</w:t>
+      </w:r>
+      <w:r>
+        <w:rPr>
+          <w:rFonts w:ascii="Times New Roman" w:hAnsi="Times New Roman" w:cs="Times New Roman"/>
+          <w:sz w:val="24"/>
+          <w:szCs w:val="24"/>
+        </w:rPr>
+        <w:t xml:space="preserve"> and floater if needed</w:t>
       </w:r>
     </w:p>
     <w:p>
@@ -717,141 +604,28 @@
           <w:sz w:val="24"/>
           <w:szCs w:val="24"/>
         </w:rPr>
-        <w:t>Derek</w:t>
-      </w:r>
-      <w:r>
-        <w:rPr>
-          <w:rFonts w:ascii="Times New Roman" w:hAnsi="Times New Roman" w:cs="Times New Roman"/>
-          <w:sz w:val="24"/>
-          <w:szCs w:val="24"/>
-        </w:rPr>
-        <w:t xml:space="preserve">: </w:t>
-      </w:r>
-      <w:r>
-        <w:rPr>
-          <w:rFonts w:ascii="Times New Roman" w:hAnsi="Times New Roman" w:cs="Times New Roman"/>
-          <w:sz w:val="24"/>
-          <w:szCs w:val="24"/>
-        </w:rPr>
-        <w:t xml:space="preserve">Project Manager </w:t>
-      </w:r>
-      <w:r>
-        <w:rPr>
-          <w:rFonts w:ascii="Times New Roman" w:hAnsi="Times New Roman" w:cs="Times New Roman"/>
-          <w:sz w:val="24"/>
-          <w:szCs w:val="24"/>
-        </w:rPr>
-        <w:t>and Logic Developer</w:t>
+        <w:t>Sutton</w:t>
+      </w:r>
+      <w:r>
+        <w:rPr>
+          <w:rFonts w:ascii="Times New Roman" w:hAnsi="Times New Roman" w:cs="Times New Roman"/>
+          <w:sz w:val="24"/>
+          <w:szCs w:val="24"/>
+        </w:rPr>
+        <w:t>: Backend Developer</w:t>
       </w:r>
     </w:p>
     <w:p>
       <w:pPr>
         <w:pStyle w:val="ListParagraph"/>
-        <w:numPr>
-          <w:ilvl w:val="2"/>
-          <w:numId w:val="2"/>
-        </w:numPr>
         <w:spacing w:line="480" w:lineRule="auto"/>
-        <w:rPr>
-          <w:rFonts w:ascii="Times New Roman" w:hAnsi="Times New Roman" w:cs="Times New Roman"/>
-          <w:sz w:val="24"/>
-          <w:szCs w:val="24"/>
-        </w:rPr>
-      </w:pPr>
-      <w:r>
-        <w:rPr>
-          <w:rFonts w:ascii="Times New Roman" w:hAnsi="Times New Roman" w:cs="Times New Roman"/>
-          <w:sz w:val="24"/>
-          <w:szCs w:val="24"/>
-        </w:rPr>
-        <w:t>Dominique</w:t>
-      </w:r>
-      <w:r>
-        <w:rPr>
-          <w:rFonts w:ascii="Times New Roman" w:hAnsi="Times New Roman" w:cs="Times New Roman"/>
-          <w:sz w:val="24"/>
-          <w:szCs w:val="24"/>
-        </w:rPr>
-        <w:t xml:space="preserve">: Debugger and </w:t>
-      </w:r>
-      <w:r>
-        <w:rPr>
-          <w:rFonts w:ascii="Times New Roman" w:hAnsi="Times New Roman" w:cs="Times New Roman"/>
-          <w:sz w:val="24"/>
-          <w:szCs w:val="24"/>
-        </w:rPr>
-        <w:t>F</w:t>
-      </w:r>
-      <w:r>
-        <w:rPr>
-          <w:rFonts w:ascii="Times New Roman" w:hAnsi="Times New Roman" w:cs="Times New Roman"/>
-          <w:sz w:val="24"/>
-          <w:szCs w:val="24"/>
-        </w:rPr>
-        <w:t>inalizer</w:t>
-      </w:r>
-    </w:p>
-    <w:p>
-      <w:pPr>
-        <w:pStyle w:val="ListParagraph"/>
-        <w:numPr>
-          <w:ilvl w:val="2"/>
-          <w:numId w:val="2"/>
-        </w:numPr>
-        <w:spacing w:line="480" w:lineRule="auto"/>
-        <w:rPr>
-          <w:rFonts w:ascii="Times New Roman" w:hAnsi="Times New Roman" w:cs="Times New Roman"/>
-          <w:sz w:val="24"/>
-          <w:szCs w:val="24"/>
-        </w:rPr>
-      </w:pPr>
-      <w:r>
-        <w:rPr>
-          <w:rFonts w:ascii="Times New Roman" w:hAnsi="Times New Roman" w:cs="Times New Roman"/>
-          <w:sz w:val="24"/>
-          <w:szCs w:val="24"/>
-        </w:rPr>
-        <w:t>Gary</w:t>
-      </w:r>
-      <w:r>
-        <w:rPr>
-          <w:rFonts w:ascii="Times New Roman" w:hAnsi="Times New Roman" w:cs="Times New Roman"/>
-          <w:sz w:val="24"/>
-          <w:szCs w:val="24"/>
-        </w:rPr>
-        <w:t>: Backend Developer</w:t>
-      </w:r>
-    </w:p>
-    <w:p>
-      <w:pPr>
-        <w:pStyle w:val="ListParagraph"/>
-        <w:numPr>
-          <w:ilvl w:val="2"/>
-          <w:numId w:val="2"/>
-        </w:numPr>
-        <w:spacing w:line="480" w:lineRule="auto"/>
-        <w:rPr>
-          <w:rFonts w:ascii="Times New Roman" w:hAnsi="Times New Roman" w:cs="Times New Roman"/>
-          <w:sz w:val="24"/>
-          <w:szCs w:val="24"/>
-        </w:rPr>
-      </w:pPr>
-      <w:r>
-        <w:rPr>
-          <w:rFonts w:ascii="Times New Roman" w:hAnsi="Times New Roman" w:cs="Times New Roman"/>
-          <w:sz w:val="24"/>
-          <w:szCs w:val="24"/>
-        </w:rPr>
-        <w:t>Sutton</w:t>
-      </w:r>
-      <w:r>
-        <w:rPr>
-          <w:rFonts w:ascii="Times New Roman" w:hAnsi="Times New Roman" w:cs="Times New Roman"/>
-          <w:sz w:val="24"/>
-          <w:szCs w:val="24"/>
-        </w:rPr>
-        <w:t>: Backend Developer</w:t>
-      </w:r>
+        <w:ind w:left="1080"/>
+        <w:rPr>
+          <w:rFonts w:ascii="Times New Roman" w:hAnsi="Times New Roman" w:cs="Times New Roman"/>
+          <w:sz w:val="24"/>
+          <w:szCs w:val="24"/>
+        </w:rPr>
+      </w:pPr>
     </w:p>
     <w:sectPr>
       <w:headerReference w:type="default" r:id="rId9"/>
@@ -1859,6 +1633,18 @@
       <w:shd w:val="clear" w:color="auto" w:fill="E1DFDD"/>
     </w:rPr>
   </w:style>
+  <w:style w:type="character" w:styleId="FollowedHyperlink">
+    <w:name w:val="FollowedHyperlink"/>
+    <w:basedOn w:val="DefaultParagraphFont"/>
+    <w:uiPriority w:val="99"/>
+    <w:semiHidden/>
+    <w:unhideWhenUsed/>
+    <w:rsid w:val="00B745BB"/>
+    <w:rPr>
+      <w:color w:val="800080" w:themeColor="followedHyperlink"/>
+      <w:u w:val="single"/>
+    </w:rPr>
+  </w:style>
 </w:styles>
 </file>
 

</xml_diff>